<commit_message>
V2.1: Rewrite all test cases with proper field-by-field form filling
- Deep structural analysis of each template's merged cells and label-value relationships
- Every field filled like a real business clerk: service type, company info, cert details,
  legal representative, address, account info (number/currency/limits), operator info
  (name/id/phone/role), authorization models, etc.
- CCB: 15+ fields including service selection checkboxes
- BOC France: 4 tables (company/accounts/auth models/operators) fully populated
- BOC Domestic: 43x42 mega-table with all sections properly filled
- BOC HK: Complex 38x24 merged-cell table with multi-operator setup
- ICBC: Dual-table (batch deduction + customer info) with complete data
</commit_message>
<xml_diff>
--- a/test_data/case_010_boc_france_pass/bank_app.docx
+++ b/test_data/case_010_boc_france_pass/bank_app.docx
@@ -3502,6 +3502,9 @@
                 <w:sz w:val="18"/>
               </w:rPr>
             </w:pPr>
+            <w:r>
+              <w:t>FR7630004000031234567890143</w:t>
+            </w:r>
           </w:p>
         </w:tc>
         <w:tc>
@@ -3521,6 +3524,9 @@
                 <w:sz w:val="18"/>
               </w:rPr>
             </w:pPr>
+            <w:r>
+              <w:t>EUR</w:t>
+            </w:r>
           </w:p>
         </w:tc>
         <w:tc>
@@ -3543,6 +3549,9 @@
                 <w:sz w:val="18"/>
               </w:rPr>
             </w:pPr>
+            <w:r>
+              <w:t>50,000.00</w:t>
+            </w:r>
           </w:p>
         </w:tc>
         <w:tc>
@@ -3562,6 +3571,9 @@
                 <w:sz w:val="18"/>
               </w:rPr>
             </w:pPr>
+            <w:r>
+              <w:t>200,000.00</w:t>
+            </w:r>
           </w:p>
         </w:tc>
         <w:tc>
@@ -3582,6 +3594,9 @@
                 <w:color w:val="000000"/>
               </w:rPr>
             </w:pPr>
+            <w:r>
+              <w:t>Model_A</w:t>
+            </w:r>
           </w:p>
         </w:tc>
       </w:tr>
@@ -3615,6 +3630,9 @@
                 <w:sz w:val="18"/>
               </w:rPr>
             </w:pPr>
+            <w:r>
+              <w:t>FR7630004000039876543210298</w:t>
+            </w:r>
           </w:p>
         </w:tc>
         <w:tc>
@@ -3633,6 +3651,9 @@
                 <w:sz w:val="18"/>
               </w:rPr>
             </w:pPr>
+            <w:r>
+              <w:t>USD</w:t>
+            </w:r>
           </w:p>
         </w:tc>
         <w:tc>
@@ -3656,6 +3677,9 @@
                 <w:color w:val="000000"/>
               </w:rPr>
             </w:pPr>
+            <w:r>
+              <w:t>100,000.00</w:t>
+            </w:r>
           </w:p>
         </w:tc>
         <w:tc>
@@ -3675,6 +3699,9 @@
                 <w:color w:val="000000"/>
               </w:rPr>
             </w:pPr>
+            <w:r>
+              <w:t>500,000.00</w:t>
+            </w:r>
           </w:p>
         </w:tc>
         <w:tc>
@@ -3694,6 +3721,9 @@
                 <w:color w:val="000000"/>
               </w:rPr>
             </w:pPr>
+            <w:r>
+              <w:t>Model_A</w:t>
+            </w:r>
           </w:p>
         </w:tc>
       </w:tr>
@@ -4991,6 +5021,9 @@
                 <w:sz w:val="18"/>
               </w:rPr>
             </w:pPr>
+            <w:r>
+              <w:t>Standard Dual Auth</w:t>
+            </w:r>
           </w:p>
         </w:tc>
         <w:tc>
@@ -6049,6 +6082,9 @@
                 <w:sz w:val="18"/>
               </w:rPr>
             </w:pPr>
+            <w:r>
+              <w:t>50,000 EUR</w:t>
+            </w:r>
           </w:p>
           <w:p>
             <w:pPr>
@@ -6061,6 +6097,7 @@
                 <w:sz w:val="18"/>
               </w:rPr>
             </w:pPr>
+            <w:r/>
           </w:p>
         </w:tc>
         <w:tc>
@@ -6084,6 +6121,9 @@
                 <w:sz w:val="18"/>
               </w:rPr>
             </w:pPr>
+            <w:r>
+              <w:t>1</w:t>
+            </w:r>
           </w:p>
         </w:tc>
         <w:tc>
@@ -6107,6 +6147,9 @@
                 <w:color w:val="000000"/>
               </w:rPr>
             </w:pPr>
+            <w:r>
+              <w:t>Li Wei / User001</w:t>
+            </w:r>
           </w:p>
         </w:tc>
         <w:tc>
@@ -6271,6 +6314,9 @@
                 <w:sz w:val="18"/>
               </w:rPr>
             </w:pPr>
+            <w:r>
+              <w:t>200,000 EUR</w:t>
+            </w:r>
           </w:p>
           <w:p>
             <w:pPr>
@@ -6283,6 +6329,7 @@
                 <w:sz w:val="18"/>
               </w:rPr>
             </w:pPr>
+            <w:r/>
           </w:p>
         </w:tc>
         <w:tc>
@@ -6306,6 +6353,9 @@
                 <w:sz w:val="18"/>
               </w:rPr>
             </w:pPr>
+            <w:r>
+              <w:t>2</w:t>
+            </w:r>
           </w:p>
         </w:tc>
         <w:tc>
@@ -6329,6 +6379,9 @@
                 <w:color w:val="000000"/>
               </w:rPr>
             </w:pPr>
+            <w:r>
+              <w:t>Li Wei + Chen Fang / User001+User002</w:t>
+            </w:r>
           </w:p>
         </w:tc>
         <w:tc>
@@ -10725,6 +10778,9 @@
                 <w:lang w:val="en-AU"/>
               </w:rPr>
             </w:pPr>
+            <w:r>
+              <w:t>+33 1 42 00 1235</w:t>
+            </w:r>
           </w:p>
         </w:tc>
         <w:tc>
@@ -10783,6 +10839,9 @@
                 <w:lang w:val="en-AU"/>
               </w:rPr>
             </w:pPr>
+            <w:r>
+              <w:t>+33 1 42 00 1234</w:t>
+            </w:r>
           </w:p>
         </w:tc>
       </w:tr>
@@ -11415,6 +11474,9 @@
                 <w:lang w:val="en-AU"/>
               </w:rPr>
             </w:pPr>
+            <w:r>
+              <w:t>FR7630004000031234567890143</w:t>
+            </w:r>
           </w:p>
         </w:tc>
         <w:tc>
@@ -11518,6 +11580,9 @@
                 <w:lang w:val="en-AU"/>
               </w:rPr>
             </w:pPr>
+            <w:r>
+              <w:t>FR7630004000039876543210298</w:t>
+            </w:r>
           </w:p>
         </w:tc>
         <w:tc>

</xml_diff>